<commit_message>
Verification pass 6: deliverables derive statements from result files, dashboard chart fixes, report corrections, mutation-tested Phase 8
</commit_message>
<xml_diff>
--- a/docs/EnduroSense_Final_Report.docx
+++ b/docs/EnduroSense_Final_Report.docx
@@ -154,7 +154,7 @@
           <w:b w:val="0"/>
           <w:i w:val="0"/>
         </w:rPr>
-        <w:t>Everything was built on 169 flights of a DJI Matrice 100 and judged once on a locked test set of 40 flights (16 battery chains) that no model, setting or calibration ever saw. What would count as success was written down before that test set was opened.</w:t>
+        <w:t>Everything was built on 169 flights of a DJI Matrice 100 and judged on a locked test set of 40 flights (16 battery chains) that no model, setting or calibration ever saw. What would count as success was written down before that test set was opened.</w:t>
       </w:r>
     </w:p>
     <w:p>
@@ -573,7 +573,7 @@
           <w:b w:val="0"/>
           <w:i w:val="0"/>
         </w:rPr>
-        <w:t>Two criteria were met and two were not. Section 6 says plainly what did not hold up. The largest and most robust gain is from deciding on energy with a calibrated safety margin instead of on minutes.</w:t>
+        <w:t>Two of the four criteria were met. Section 6 says plainly what did not hold up. The largest and most robust gain is from deciding on energy with a calibrated safety margin instead of on minutes.</w:t>
       </w:r>
     </w:p>
     <w:p>
@@ -770,7 +770,7 @@
           <w:b w:val="0"/>
           <w:i w:val="0"/>
         </w:rPr>
-        <w:t>All five algorithms in the brief were compared with grouped cross-validation, together with three baselines that need no machine learning. GRU (2.61 Wh) and LSTM (2.65 Wh) were the only models clearly better than a fair voltage-lookup baseline (3.22 Wh); Random Forest, Linear Regression and XGBoost were about 3.0 Wh. Every model predicts one reading in about 5 ms or less on a laptop CPU.</w:t>
+        <w:t>All five algorithms in the brief were compared with grouped cross-validation, together with three baselines that need no machine learning. On readings with a pre-flight voltage, GRU (2.39 Wh) and LSTM (2.45 Wh) were the most accurate, against 2.82 Wh for a fair voltage-lookup baseline; Random Forest, Linear Regression and XGBoost were between 2.6 and 2.9 Wh. Every model predicts one reading in 6 ms or less on a laptop CPU.</w:t>
       </w:r>
     </w:p>
     <w:p>
@@ -1757,7 +1757,7 @@
           <w:b w:val="0"/>
           <w:i w:val="0"/>
         </w:rPr>
-        <w:t xml:space="preserve"> the 90% range covered 93.8% of test readings (plausible band with 11 batteries: 83%–100%). All misses were on two batteries whose capacity the model over-estimated; the other nine were inside their range throughout. The risk is per battery, not per moment.</w:t>
+        <w:t xml:space="preserve"> the 90% range covered 93.8% of test readings (plausible band with 11 batteries: 83%–100%). Almost all the misses were on two batteries whose capacity the model over-estimated; the other nine were inside their range for at least 99.8% of their readings. The risk is per battery, not per moment.</w:t>
       </w:r>
     </w:p>
     <w:p>
@@ -3009,7 +3009,7 @@
           <w:b w:val="0"/>
           <w:i w:val="0"/>
         </w:rPr>
-        <w:t xml:space="preserve"> To reach the same safety it must refuse 91% of feasible missions.</w:t>
+        <w:t xml:space="preserve"> With the margin that made it as safe in development, it refuses 91% of feasible missions.</w:t>
       </w:r>
     </w:p>
     <w:p>
@@ -3265,7 +3265,7 @@
                 <w:b w:val="0"/>
                 <w:sz w:val="19"/>
               </w:rPr>
-              <w:t>12.03</w:t>
+              <w:t>12.0</w:t>
             </w:r>
           </w:p>
         </w:tc>
@@ -3342,7 +3342,7 @@
                 <w:b w:val="0"/>
                 <w:sz w:val="19"/>
               </w:rPr>
-              <w:t>4.94</w:t>
+              <w:t>4.9</w:t>
             </w:r>
           </w:p>
         </w:tc>
@@ -3708,7 +3708,7 @@
           <w:b w:val="0"/>
           <w:i w:val="0"/>
         </w:rPr>
-        <w:t>A calibrated GRU ensemble estimates energy to reserve to about 2.2 Wh (about 3% of a pack’s usable energy) on unseen batteries and beats a fair baseline without machine learning.</w:t>
+        <w:t>A calibrated GRU ensemble estimates energy to reserve to about 2.2 Wh on unseen batteries and beats a fair baseline without machine learning (2.9 Wh).</w:t>
       </w:r>
     </w:p>
     <w:p>
@@ -3734,7 +3734,7 @@
           <w:b w:val="0"/>
           <w:i w:val="0"/>
         </w:rPr>
-        <w:t>Deciding on energy with a calibrated margin cuts unsafe approvals from about 12% to under 1%, and to zero at take-off decisions.</w:t>
+        <w:t>Deciding on energy with a calibrated margin cuts unsafe approvals from about 12% to 0.6%, and to zero at take-off decisions.</w:t>
       </w:r>
     </w:p>
     <w:p>
@@ -4001,7 +4001,7 @@
           <w:b/>
           <w:i w:val="0"/>
         </w:rPr>
-        <w:t>Five verification passes</w:t>
+        <w:t>Six verification passes</w:t>
       </w:r>
       <w:r>
         <w:rPr>
@@ -4229,7 +4229,7 @@
           <w:b w:val="0"/>
           <w:i w:val="0"/>
         </w:rPr>
-        <w:t xml:space="preserve"> on a companion computer (for example a Raspberry Pi); on a laptop CPU every model predicts in about 5 ms or less.</w:t>
+        <w:t xml:space="preserve"> on a companion computer (for example a Raspberry Pi); on a laptop CPU every model predicts in 6 ms or less.</w:t>
       </w:r>
     </w:p>
     <w:p>

</xml_diff>